<commit_message>
Prepara a retomada com acesso de rede liberado
- CLAUDE.md: contexto do trabalho, estado atual, próximos passos em ordem e a
  regra de que nenhum número entra nos documentos sem ter sido medido. A sessão
  nova nasce sabendo disso sem precisar reconstruir o histórico.

- ferramenta/avaliar.sh: roda a avaliação inteira num comando — confere se a
  rede alcança o site, audita as páginas, simula o acesso por smartphone e
  regera os documentos. Falha cedo, com mensagem clara, quando o domínio ainda
  não está liberado.

- simulador_mobile.py passa a contar os recursos que não carregam (CSS, fontes,
  scripts, imagens). Um CDN bloqueado fazia a página ser medida sem a aparência
  real, e contraste e reflow saíam errados sem qualquer aviso. Agora a saída
  nomeia os domínios envolvidos e marca a medição como não confiável.

Co-Authored-By: Claude Opus 5 <noreply@anthropic.com>
Claude-Session: https://claude.ai/code/session_01P7CQ66uwaiuJDfW2UoBWp1
</commit_message>
<xml_diff>
--- a/relatorio/RELATORIO_AVALIACAO_ACESSIBILIDADE_WCAG.docx
+++ b/relatorio/RELATORIO_AVALIACAO_ACESSIBILIDADE_WCAG.docx
@@ -2281,7 +2281,7 @@
                 <w:b w:val="0"/>
                 <w:sz w:val="20"/>
               </w:rPr>
-              <w:t>Cor não e o único meio de transmitir informação</w:t>
+              <w:t>Cor não é o único meio de transmitir informação</w:t>
             </w:r>
           </w:p>
         </w:tc>
@@ -2881,7 +2881,7 @@
                 <w:b w:val="0"/>
                 <w:sz w:val="20"/>
               </w:rPr>
-              <w:t>Identificacao e sugestao de correção de erros</w:t>
+              <w:t>Identificação e sugestão de correção de erros</w:t>
             </w:r>
           </w:p>
         </w:tc>
@@ -2900,7 +2900,7 @@
                 <w:b w:val="0"/>
                 <w:sz w:val="20"/>
               </w:rPr>
-              <w:t>3.3.1 Identificacao do erro / 3.3.3 Sugestao de erro (A / AA)</w:t>
+              <w:t>3.3.1 Identificação do erro / 3.3.3 Sugestão de erro (A / AA)</w:t>
             </w:r>
           </w:p>
         </w:tc>

</xml_diff>